<commit_message>
add new gam table
</commit_message>
<xml_diff>
--- a/Paper/Submission/RSE/Cover_letter_RSE.docx
+++ b/Paper/Submission/RSE/Cover_letter_RSE.docx
@@ -122,13 +122,10 @@
           <w:szCs w:val="16"/>
           <w:lang w:val="fr-FR" w:eastAsia="en-GB"/>
         </w:rPr>
-        <w:t>PhD student</w:t>
-      </w:r>
-    </w:p>
-    <w:p>
-      <w:pPr>
-        <w:spacing w:after="0" w:line="240" w:lineRule="auto"/>
-        <w:jc w:val="right"/>
+        <w:t xml:space="preserve">PhD </w:t>
+      </w:r>
+      <w:proofErr w:type="spellStart"/>
+      <w:r>
         <w:rPr>
           <w:rFonts w:ascii="Calibri" w:eastAsia="Times New Roman" w:hAnsi="Calibri" w:cs="Calibri"/>
           <w:color w:val="000000"/>
@@ -136,28 +133,9 @@
           <w:szCs w:val="16"/>
           <w:lang w:val="fr-FR" w:eastAsia="en-GB"/>
         </w:rPr>
-      </w:pPr>
-      <w:r>
-        <w:rPr>
-          <w:rFonts w:ascii="Calibri" w:eastAsia="Times New Roman" w:hAnsi="Calibri" w:cs="Calibri"/>
-          <w:color w:val="000000"/>
-          <w:sz w:val="16"/>
-          <w:szCs w:val="16"/>
-          <w:lang w:val="fr-FR" w:eastAsia="en-GB"/>
-        </w:rPr>
-        <w:t>Laboratoire ISOMer</w:t>
-      </w:r>
-      <w:r>
-        <w:rPr>
-          <w:rFonts w:ascii="Calibri" w:eastAsia="Times New Roman" w:hAnsi="Calibri" w:cs="Calibri"/>
-          <w:color w:val="000000"/>
-          <w:sz w:val="16"/>
-          <w:szCs w:val="16"/>
-          <w:lang w:val="fr-FR" w:eastAsia="en-GB"/>
-        </w:rPr>
-        <w:br/>
-        <w:t>UFR Sciences et Techniques</w:t>
-      </w:r>
+        <w:t>student</w:t>
+      </w:r>
+      <w:proofErr w:type="spellEnd"/>
     </w:p>
     <w:p>
       <w:pPr>
@@ -202,9 +180,13 @@
           <w:szCs w:val="16"/>
           <w:lang w:val="en-US" w:eastAsia="en-GB"/>
         </w:rPr>
-        <w:t xml:space="preserve">Email: </w:t>
-      </w:r>
-      <w:r>
+        <w:t>France</w:t>
+      </w:r>
+    </w:p>
+    <w:p>
+      <w:pPr>
+        <w:spacing w:after="0" w:line="240" w:lineRule="auto"/>
+        <w:jc w:val="right"/>
         <w:rPr>
           <w:rFonts w:ascii="Calibri" w:eastAsia="Times New Roman" w:hAnsi="Calibri" w:cs="Calibri"/>
           <w:color w:val="000000"/>
@@ -212,8 +194,7 @@
           <w:szCs w:val="16"/>
           <w:lang w:val="en-US" w:eastAsia="en-GB"/>
         </w:rPr>
-        <w:t>oirysimon</w:t>
-      </w:r>
+      </w:pPr>
       <w:r>
         <w:rPr>
           <w:rFonts w:ascii="Calibri" w:eastAsia="Times New Roman" w:hAnsi="Calibri" w:cs="Calibri"/>
@@ -222,7 +203,7 @@
           <w:szCs w:val="16"/>
           <w:lang w:val="en-US" w:eastAsia="en-GB"/>
         </w:rPr>
-        <w:t>@</w:t>
+        <w:t xml:space="preserve">Email: </w:t>
       </w:r>
       <w:r>
         <w:rPr>
@@ -232,7 +213,7 @@
           <w:szCs w:val="16"/>
           <w:lang w:val="en-US" w:eastAsia="en-GB"/>
         </w:rPr>
-        <w:t>gmail</w:t>
+        <w:t>oirysimon</w:t>
       </w:r>
       <w:r>
         <w:rPr>
@@ -242,7 +223,37 @@
           <w:szCs w:val="16"/>
           <w:lang w:val="en-US" w:eastAsia="en-GB"/>
         </w:rPr>
-        <w:t>.fr</w:t>
+        <w:t>@</w:t>
+      </w:r>
+      <w:r>
+        <w:rPr>
+          <w:rFonts w:ascii="Calibri" w:eastAsia="Times New Roman" w:hAnsi="Calibri" w:cs="Calibri"/>
+          <w:color w:val="000000"/>
+          <w:sz w:val="16"/>
+          <w:szCs w:val="16"/>
+          <w:lang w:val="en-US" w:eastAsia="en-GB"/>
+        </w:rPr>
+        <w:t>gmail</w:t>
+      </w:r>
+      <w:r>
+        <w:rPr>
+          <w:rFonts w:ascii="Calibri" w:eastAsia="Times New Roman" w:hAnsi="Calibri" w:cs="Calibri"/>
+          <w:color w:val="000000"/>
+          <w:sz w:val="16"/>
+          <w:szCs w:val="16"/>
+          <w:lang w:val="en-US" w:eastAsia="en-GB"/>
+        </w:rPr>
+        <w:t>.</w:t>
+      </w:r>
+      <w:r>
+        <w:rPr>
+          <w:rFonts w:ascii="Calibri" w:eastAsia="Times New Roman" w:hAnsi="Calibri" w:cs="Calibri"/>
+          <w:color w:val="000000"/>
+          <w:sz w:val="16"/>
+          <w:szCs w:val="16"/>
+          <w:lang w:val="en-US" w:eastAsia="en-GB"/>
+        </w:rPr>
+        <w:t>com</w:t>
       </w:r>
     </w:p>
     <w:p>
@@ -495,173 +506,67 @@
         <w:pStyle w:val="Textebrut"/>
         <w:jc w:val="both"/>
         <w:rPr>
-          <w:del w:id="0" w:author="simon oiry" w:date="2025-02-26T21:44:00Z" w16du:dateUtc="2025-02-26T20:44:00Z"/>
+          <w:rFonts w:cs="Calibri"/>
+          <w:lang w:val="en-AU"/>
+        </w:rPr>
+      </w:pPr>
+      <w:r>
+        <w:rPr>
+          <w:rFonts w:cs="Calibri"/>
+          <w:lang w:val="en-AU"/>
+        </w:rPr>
+        <w:t>Please find attached a manuscript entitled "</w:t>
+      </w:r>
+      <w:r>
+        <w:rPr>
+          <w:rFonts w:cs="Calibri"/>
+          <w:b/>
+        </w:rPr>
+        <w:t>Heatwave impacts on intertidal seagrass reflectance: from laboratory experiment to satellite mapping of seagrass heat shock index</w:t>
+      </w:r>
+      <w:r>
+        <w:rPr>
+          <w:rFonts w:cs="Calibri"/>
+          <w:lang w:val="en-AU"/>
+        </w:rPr>
+        <w:t xml:space="preserve"> ", for consideration for</w:t>
+      </w:r>
+      <w:r>
+        <w:rPr>
+          <w:rFonts w:cs="Calibri"/>
+          <w:lang w:val="en-AU"/>
+        </w:rPr>
+        <w:t xml:space="preserve"> </w:t>
+      </w:r>
+      <w:r>
+        <w:rPr>
+          <w:rFonts w:cs="Calibri"/>
+          <w:lang w:val="en-AU"/>
+        </w:rPr>
+        <w:t xml:space="preserve">publication in </w:t>
+      </w:r>
+      <w:r>
+        <w:rPr>
           <w:rFonts w:cs="Calibri"/>
           <w:i/>
-          <w:lang w:val="en-US"/>
-        </w:rPr>
-      </w:pPr>
-      <w:ins w:id="1" w:author="simon oiry" w:date="2025-02-26T21:43:00Z" w16du:dateUtc="2025-02-26T20:43:00Z">
-        <w:r>
-          <w:rPr>
-            <w:rFonts w:cs="Calibri"/>
-            <w:lang w:val="en-AU"/>
-          </w:rPr>
-          <w:t>Please find attached a manuscript entitled "</w:t>
-        </w:r>
-      </w:ins>
-      <w:ins w:id="2" w:author="simon oiry" w:date="2025-02-26T21:44:00Z" w16du:dateUtc="2025-02-26T20:44:00Z">
-        <w:r>
-          <w:rPr>
-            <w:rFonts w:cs="Calibri"/>
-            <w:lang w:val="en-AU"/>
-          </w:rPr>
-          <w:tab/>
-        </w:r>
-      </w:ins>
-      <w:ins w:id="3" w:author="simon oiry" w:date="2025-02-26T21:43:00Z" w16du:dateUtc="2025-02-26T20:43:00Z">
-        <w:r>
-          <w:rPr>
-            <w:rFonts w:cs="Calibri"/>
-            <w:b/>
-          </w:rPr>
-          <w:t>Heatwave impacts on intertidal seagrass reflectance: from laboratory experiment to satellite mapping of seagrass heat shock index</w:t>
-        </w:r>
-        <w:r>
-          <w:rPr>
-            <w:rFonts w:cs="Calibri"/>
-            <w:lang w:val="en-AU"/>
-          </w:rPr>
-          <w:t xml:space="preserve"> </w:t>
-        </w:r>
-        <w:r>
-          <w:rPr>
-            <w:rFonts w:cs="Calibri"/>
-            <w:lang w:val="en-AU"/>
-          </w:rPr>
-          <w:t>", for consideration for</w:t>
-        </w:r>
-      </w:ins>
-      <w:ins w:id="4" w:author="simon oiry" w:date="2025-02-26T21:44:00Z" w16du:dateUtc="2025-02-26T20:44:00Z">
-        <w:r>
-          <w:rPr>
-            <w:rFonts w:cs="Calibri"/>
-            <w:lang w:val="en-AU"/>
-          </w:rPr>
-          <w:t xml:space="preserve"> </w:t>
-        </w:r>
-      </w:ins>
-      <w:ins w:id="5" w:author="simon oiry" w:date="2025-02-26T21:43:00Z" w16du:dateUtc="2025-02-26T20:43:00Z">
-        <w:r>
-          <w:rPr>
-            <w:rFonts w:cs="Calibri"/>
-            <w:lang w:val="en-AU"/>
-          </w:rPr>
-          <w:t>publication in Remote Sensing of Environment.</w:t>
-        </w:r>
-      </w:ins>
-      <w:del w:id="6" w:author="simon oiry" w:date="2025-02-26T21:44:00Z" w16du:dateUtc="2025-02-26T20:44:00Z">
-        <w:r>
-          <w:rPr>
-            <w:rFonts w:cs="Calibri"/>
-            <w:lang w:val="en-AU"/>
-          </w:rPr>
-          <w:delText xml:space="preserve">I </w:delText>
-        </w:r>
-        <w:r>
-          <w:rPr>
-            <w:rFonts w:cs="Calibri"/>
-            <w:lang w:val="en-AU"/>
-          </w:rPr>
-          <w:delText>hope that</w:delText>
-        </w:r>
-        <w:r>
-          <w:rPr>
-            <w:rFonts w:cs="Calibri"/>
-            <w:lang w:val="en-AU"/>
-          </w:rPr>
-          <w:delText xml:space="preserve"> the </w:delText>
-        </w:r>
-        <w:r>
-          <w:rPr>
-            <w:rFonts w:cs="Calibri"/>
-            <w:lang w:val="en-AU"/>
-          </w:rPr>
-          <w:delText>following</w:delText>
-        </w:r>
-        <w:r>
-          <w:rPr>
-            <w:rFonts w:cs="Calibri"/>
-            <w:lang w:val="en-AU"/>
-          </w:rPr>
-          <w:delText xml:space="preserve"> research</w:delText>
-        </w:r>
-        <w:r>
-          <w:rPr>
-            <w:rFonts w:cs="Calibri"/>
-            <w:lang w:val="en-AU"/>
-          </w:rPr>
-          <w:delText xml:space="preserve"> </w:delText>
-        </w:r>
-        <w:r>
-          <w:rPr>
-            <w:rFonts w:cs="Calibri"/>
-            <w:lang w:val="en-AU"/>
-          </w:rPr>
-          <w:delText>article</w:delText>
-        </w:r>
-        <w:r>
-          <w:rPr>
-            <w:rFonts w:cs="Calibri"/>
-            <w:lang w:val="en-AU"/>
-          </w:rPr>
-          <w:delText xml:space="preserve"> </w:delText>
-        </w:r>
-        <w:r>
-          <w:rPr>
-            <w:rFonts w:cs="Calibri"/>
-            <w:lang w:val="en-AU"/>
-          </w:rPr>
-          <w:delText>will</w:delText>
-        </w:r>
-        <w:r>
-          <w:rPr>
-            <w:rFonts w:cs="Calibri"/>
-            <w:lang w:val="en-AU"/>
-          </w:rPr>
-          <w:delText xml:space="preserve"> be considered for publication in </w:delText>
-        </w:r>
-        <w:r>
-          <w:rPr>
-            <w:rFonts w:cs="Calibri"/>
-            <w:i/>
-            <w:lang w:val="en-US"/>
-          </w:rPr>
-          <w:delText xml:space="preserve">Remote Sensing of </w:delText>
-        </w:r>
-        <w:r>
-          <w:rPr>
-            <w:rFonts w:cs="Calibri"/>
-            <w:i/>
-            <w:lang w:val="en-US"/>
-          </w:rPr>
-          <w:delText>Environment</w:delText>
-        </w:r>
-        <w:r>
-          <w:rPr>
-            <w:rFonts w:cs="Calibri"/>
-            <w:lang w:val="en-AU"/>
-          </w:rPr>
-          <w:delText>:</w:delText>
-        </w:r>
-      </w:del>
+          <w:iCs/>
+          <w:lang w:val="en-AU"/>
+        </w:rPr>
+        <w:t>Remote Sensing of Environment</w:t>
+      </w:r>
+      <w:r>
+        <w:rPr>
+          <w:rFonts w:cs="Calibri"/>
+          <w:lang w:val="en-AU"/>
+        </w:rPr>
+        <w:t>.</w:t>
+      </w:r>
     </w:p>
     <w:p>
       <w:pPr>
         <w:pStyle w:val="Textebrut"/>
         <w:jc w:val="both"/>
         <w:rPr>
-          <w:del w:id="7" w:author="simon oiry" w:date="2025-02-26T21:44:00Z" w16du:dateUtc="2025-02-26T20:44:00Z"/>
           <w:rFonts w:cs="Calibri"/>
           <w:b/>
         </w:rPr>
@@ -672,27 +577,31 @@
         <w:pStyle w:val="Textebrut"/>
         <w:jc w:val="both"/>
         <w:rPr>
-          <w:del w:id="8" w:author="simon oiry" w:date="2025-02-26T21:44:00Z" w16du:dateUtc="2025-02-26T20:44:00Z"/>
-          <w:rFonts w:cs="Calibri"/>
-          <w:b/>
-        </w:rPr>
-      </w:pPr>
-      <w:del w:id="9" w:author="simon oiry" w:date="2025-02-26T21:44:00Z" w16du:dateUtc="2025-02-26T20:44:00Z">
-        <w:r>
-          <w:rPr>
-            <w:rFonts w:cs="Calibri"/>
-            <w:b/>
-          </w:rPr>
-          <w:delText>Heatwave impacts on intertidal seagrass reflectance: from laboratory experiment to satellite mapping of seagrass heat shock index</w:delText>
-        </w:r>
-        <w:r>
-          <w:rPr>
-            <w:rFonts w:cs="Calibri"/>
-            <w:b/>
-          </w:rPr>
-          <w:delText>.</w:delText>
-        </w:r>
-      </w:del>
+          <w:rFonts w:cs="Calibri"/>
+          <w:bCs/>
+        </w:rPr>
+      </w:pPr>
+      <w:r>
+        <w:rPr>
+          <w:rFonts w:cs="Calibri"/>
+          <w:bCs/>
+        </w:rPr>
+        <w:t xml:space="preserve">Seagrasses play a crucial role in coastal ecosystems, providing essential services such as habitat provision, sediment stabilization, and carbon sequestration. They contribute significantly to maintaining water quality, supporting fisheries, and mitigating coastal erosion. However, the increasing frequency and intensity of marine and atmospheric heatwaves, driven by climate change, present a major threat to </w:t>
+      </w:r>
+      <w:r>
+        <w:rPr>
+          <w:rFonts w:cs="Calibri"/>
+          <w:bCs/>
+        </w:rPr>
+        <w:t>the health of the habitats they form</w:t>
+      </w:r>
+      <w:r>
+        <w:rPr>
+          <w:rFonts w:cs="Calibri"/>
+          <w:bCs/>
+        </w:rPr>
+        <w:t xml:space="preserve">. These extreme climatic events induce physiological stress, disrupt ecosystem functions, and accelerate habitat degradation, ultimately threatening the biodiversity and ecological resilience of intertidal seagrass meadows. Remote sensing is a vital tool for seagrass monitoring, offering a non-invasive and large-scale approach to detecting changes in seagrass extent and density. This capability is crucial for understanding the rapid impacts of climate change on intertidal ecosystems and developing targeted conservation strategies. </w:t>
+      </w:r>
     </w:p>
     <w:p>
       <w:pPr>
@@ -700,9 +609,71 @@
         <w:jc w:val="both"/>
         <w:rPr>
           <w:rFonts w:cs="Calibri"/>
-          <w:b/>
-        </w:rPr>
-      </w:pPr>
+          <w:bCs/>
+        </w:rPr>
+      </w:pPr>
+    </w:p>
+    <w:p>
+      <w:pPr>
+        <w:pStyle w:val="Textebrut"/>
+        <w:rPr>
+          <w:rFonts w:cs="Calibri"/>
+          <w:bCs/>
+        </w:rPr>
+      </w:pPr>
+      <w:r>
+        <w:rPr>
+          <w:rFonts w:cs="Calibri"/>
+          <w:bCs/>
+        </w:rPr>
+        <w:t xml:space="preserve">The impact of heatwaves on subtidal seagrasses has been extensively studied; however, research on intertidal seagrasses, which experience both marine and terrestrial stressors, remains limited. Furthermore, while previous studies have predominantly explored the relationship between environmental pressures and physiological responses, none have specifically investigated the effects of extreme climatic events on the spectral reflectance of seagrasses. This study addresses this research gap by </w:t>
+      </w:r>
+      <w:proofErr w:type="spellStart"/>
+      <w:r>
+        <w:rPr>
+          <w:rFonts w:cs="Calibri"/>
+          <w:bCs/>
+        </w:rPr>
+        <w:t>analyzing</w:t>
+      </w:r>
+      <w:proofErr w:type="spellEnd"/>
+      <w:r>
+        <w:rPr>
+          <w:rFonts w:cs="Calibri"/>
+          <w:bCs/>
+        </w:rPr>
+        <w:t xml:space="preserve"> how heatwave-induced stress alters seagrass reflectance using laboratory experiment. From our experimental results, we developed a new seagrass heat shock index (SHSI) specifically designed for remote sensing application. The SHSI is a novel spectral index able to quantify the severity of heatwave impact by measuring and quantifying the transition from green to brown leaves observed in the lab and in the field. We applied and validated the SHSI index to Sentinel-2 images </w:t>
+      </w:r>
+      <w:proofErr w:type="gramStart"/>
+      <w:r>
+        <w:rPr>
+          <w:rFonts w:cs="Calibri"/>
+          <w:bCs/>
+        </w:rPr>
+        <w:t>in order to</w:t>
+      </w:r>
+      <w:proofErr w:type="gramEnd"/>
+      <w:r>
+        <w:rPr>
+          <w:rFonts w:cs="Calibri"/>
+          <w:bCs/>
+        </w:rPr>
+        <w:t xml:space="preserve"> monitor a heatwave </w:t>
+      </w:r>
+      <w:r>
+        <w:rPr>
+          <w:rFonts w:cs="Calibri"/>
+          <w:bCs/>
+        </w:rPr>
+        <w:t>event and</w:t>
+      </w:r>
+      <w:r>
+        <w:rPr>
+          <w:rFonts w:cs="Calibri"/>
+          <w:bCs/>
+        </w:rPr>
+        <w:t xml:space="preserve"> documented the heatwave impact on seagrass spatial distribution and temporal variations. Altogether, our results demonstrate the potential of remote sensing to detect early signs of heatwave-induced stress in seagrasses and enable large-scale monitoring of vulnerable intertidal habitats.</w:t>
+      </w:r>
     </w:p>
     <w:p>
       <w:pPr>
@@ -713,38 +684,6 @@
           <w:bCs/>
         </w:rPr>
       </w:pPr>
-      <w:r>
-        <w:rPr>
-          <w:rFonts w:cs="Calibri"/>
-          <w:bCs/>
-        </w:rPr>
-        <w:t xml:space="preserve">Seagrasses play a crucial role in coastal ecosystems, providing essential services such as habitat provision, sediment stabilization, and carbon sequestration. They contribute significantly to maintaining water quality, supporting fisheries, and mitigating coastal erosion. However, the increasing frequency and intensity of marine and atmospheric heatwaves, driven by climate change, present a major threat to </w:t>
-      </w:r>
-      <w:del w:id="10" w:author="simon oiry" w:date="2025-02-26T21:32:00Z" w16du:dateUtc="2025-02-26T20:32:00Z">
-        <w:r>
-          <w:rPr>
-            <w:rFonts w:cs="Calibri"/>
-            <w:bCs/>
-          </w:rPr>
-          <w:delText>their stability</w:delText>
-        </w:r>
-      </w:del>
-      <w:ins w:id="11" w:author="simon oiry" w:date="2025-02-26T21:32:00Z" w16du:dateUtc="2025-02-26T20:32:00Z">
-        <w:r>
-          <w:rPr>
-            <w:rFonts w:cs="Calibri"/>
-            <w:bCs/>
-          </w:rPr>
-          <w:t>the health of the habitats they form</w:t>
-        </w:r>
-      </w:ins>
-      <w:r>
-        <w:rPr>
-          <w:rFonts w:cs="Calibri"/>
-          <w:bCs/>
-        </w:rPr>
-        <w:t>. These extreme climatic events induce physiological stress, disrupt ecosystem functions, and accelerate habitat degradation, ultimately threatening the biodiversity and ecological resilience of intertidal seagrass meadows. Remote sensing is a vital tool for seagrass monitoring, offering a non-invasive and large-scale approach to detecting changes in seagrass extent and density. This capability is crucial for understanding the rapid impacts of climate change on intertidal ecosystems and developing targeted conservation strategies. The impact of heatwaves on subtidal seagrasses has been extensively studied; however, research on intertidal seagrasses, which experience both marine and terrestrial stressors, remains limited. Furthermore, while previous studies have predominantly explored the relationship between environmental pressures and physiological responses, none have specifically investigated the effects of extreme climatic events on the spectral reflectance of seagrasses. This study addresses this research gap by analyzing how heatwave-induced stress alters seagrass reflectance.</w:t>
-      </w:r>
     </w:p>
     <w:p>
       <w:pPr>
@@ -755,6 +694,13 @@
           <w:bCs/>
         </w:rPr>
       </w:pPr>
+      <w:r>
+        <w:rPr>
+          <w:rFonts w:cs="Calibri"/>
+          <w:bCs/>
+        </w:rPr>
+        <w:t>This new capacity to detect heatwave-impacted seagrass at large scale using remote sensing will be particularly significant for conservation and rewilding initiatives. Seagrass restoration is a nature-based solution for greenhouse gas mitigation that could be negatively affected by heatwaves. Restoration is currently increasing worldwide supporting the Sustainable Development Goals (SDGs) of the United Nations.</w:t>
+      </w:r>
     </w:p>
     <w:p>
       <w:pPr>
@@ -770,82 +716,7 @@
           <w:rFonts w:cs="Calibri"/>
           <w:bCs/>
         </w:rPr>
-        <w:t>Under controlled conditions, hyperspectral reflectance measurements of Zostera noltei exposed to heat stress revealed significant declines in the green and near-infrared spectral regions, corresponding to leaf browning. Key vegetation indices such as NDVI and Green Leaf Index (GLI) decreased by up to 34% and 57%, respectively, under heat stress. To enhance monitoring capabilities, we developed the Seagrass Heat Shock Index (SHSI), a novel spectral index that effectively captures the transition from green to brown leaves. Applying this index to Sentinel-2 imagery</w:t>
-      </w:r>
-      <w:ins w:id="12" w:author="simon oiry" w:date="2025-02-26T21:33:00Z" w16du:dateUtc="2025-02-26T20:33:00Z">
-        <w:r>
-          <w:rPr>
-            <w:rFonts w:cs="Calibri"/>
-            <w:bCs/>
-          </w:rPr>
-          <w:t xml:space="preserve"> during a heatwave e</w:t>
-        </w:r>
-      </w:ins>
-      <w:ins w:id="13" w:author="simon oiry" w:date="2025-02-26T21:34:00Z" w16du:dateUtc="2025-02-26T20:34:00Z">
-        <w:r>
-          <w:rPr>
-            <w:rFonts w:cs="Calibri"/>
-            <w:bCs/>
-          </w:rPr>
-          <w:t>vent</w:t>
-        </w:r>
-      </w:ins>
-      <w:r>
-        <w:rPr>
-          <w:rFonts w:cs="Calibri"/>
-          <w:bCs/>
-        </w:rPr>
-        <w:t>, we identified widespread browning of intertidal seagrass in South Brittany, France</w:t>
-      </w:r>
-      <w:del w:id="14" w:author="simon oiry" w:date="2025-02-26T21:34:00Z" w16du:dateUtc="2025-02-26T20:34:00Z">
-        <w:r>
-          <w:rPr>
-            <w:rFonts w:cs="Calibri"/>
-            <w:bCs/>
-          </w:rPr>
-          <w:delText>, during extreme heatwave conditions</w:delText>
-        </w:r>
-      </w:del>
-      <w:r>
-        <w:rPr>
-          <w:rFonts w:cs="Calibri"/>
-          <w:bCs/>
-        </w:rPr>
-        <w:t xml:space="preserve">. Satellite-derived SHSI values correlated with in situ measurements, </w:t>
-      </w:r>
-      <w:r>
-        <w:rPr>
-          <w:rFonts w:cs="Calibri"/>
-          <w:bCs/>
-        </w:rPr>
         <w:lastRenderedPageBreak/>
-        <w:t>demonstrating the potential of remote sensing to detect early signs of heatwave-induced stress in seagrasses and enabling large-scale monitoring of vulnerable intertidal habitats.</w:t>
-      </w:r>
-    </w:p>
-    <w:p>
-      <w:pPr>
-        <w:pStyle w:val="Textebrut"/>
-        <w:jc w:val="both"/>
-        <w:rPr>
-          <w:rFonts w:cs="Calibri"/>
-          <w:bCs/>
-        </w:rPr>
-      </w:pPr>
-    </w:p>
-    <w:p>
-      <w:pPr>
-        <w:pStyle w:val="Textebrut"/>
-        <w:jc w:val="both"/>
-        <w:rPr>
-          <w:rFonts w:cs="Calibri"/>
-          <w:bCs/>
-        </w:rPr>
-      </w:pPr>
-      <w:r>
-        <w:rPr>
-          <w:rFonts w:cs="Calibri"/>
-          <w:bCs/>
-        </w:rPr>
         <w:t>For the consideration of this manuscript, we suggest the following reviewers:</w:t>
       </w:r>
     </w:p>
@@ -887,7 +758,14 @@
           <w:rFonts w:cs="Calibri"/>
           <w:bCs/>
         </w:rPr>
-        <w:t>Machin 1</w:t>
+        <w:t>Reviewer</w:t>
+      </w:r>
+      <w:r>
+        <w:rPr>
+          <w:rFonts w:cs="Calibri"/>
+          <w:bCs/>
+        </w:rPr>
+        <w:t xml:space="preserve"> 1</w:t>
       </w:r>
     </w:p>
     <w:p>
@@ -908,7 +786,14 @@
           <w:rFonts w:cs="Calibri"/>
           <w:bCs/>
         </w:rPr>
-        <w:t>Machin 2</w:t>
+        <w:t>Reviewer</w:t>
+      </w:r>
+      <w:r>
+        <w:rPr>
+          <w:rFonts w:cs="Calibri"/>
+          <w:bCs/>
+        </w:rPr>
+        <w:t xml:space="preserve"> 2</w:t>
       </w:r>
     </w:p>
     <w:p>
@@ -929,7 +814,14 @@
           <w:rFonts w:cs="Calibri"/>
           <w:bCs/>
         </w:rPr>
-        <w:t>Machin 3</w:t>
+        <w:t>Reviewer</w:t>
+      </w:r>
+      <w:r>
+        <w:rPr>
+          <w:rFonts w:cs="Calibri"/>
+          <w:bCs/>
+        </w:rPr>
+        <w:t xml:space="preserve"> 3</w:t>
       </w:r>
     </w:p>
     <w:p>
@@ -950,7 +842,14 @@
           <w:rFonts w:cs="Calibri"/>
           <w:bCs/>
         </w:rPr>
-        <w:t>Machin 4</w:t>
+        <w:t>Reviewer</w:t>
+      </w:r>
+      <w:r>
+        <w:rPr>
+          <w:rFonts w:cs="Calibri"/>
+          <w:bCs/>
+        </w:rPr>
+        <w:t xml:space="preserve"> 4</w:t>
       </w:r>
     </w:p>
     <w:p>
@@ -968,36 +867,6 @@
         <w:pStyle w:val="Textebrut"/>
         <w:jc w:val="both"/>
         <w:rPr>
-          <w:del w:id="15" w:author="simon oiry" w:date="2025-02-26T21:34:00Z" w16du:dateUtc="2025-02-26T20:34:00Z"/>
-          <w:rFonts w:cs="Calibri"/>
-          <w:bCs/>
-        </w:rPr>
-      </w:pPr>
-      <w:del w:id="16" w:author="simon oiry" w:date="2025-02-26T21:34:00Z" w16du:dateUtc="2025-02-26T20:34:00Z">
-        <w:r>
-          <w:rPr>
-            <w:rFonts w:cs="Calibri"/>
-            <w:bCs/>
-          </w:rPr>
-          <w:delText>If we can provide further referee suggestions, please do not hesitate to contact me.</w:delText>
-        </w:r>
-      </w:del>
-    </w:p>
-    <w:p>
-      <w:pPr>
-        <w:pStyle w:val="Textebrut"/>
-        <w:jc w:val="both"/>
-        <w:rPr>
-          <w:rFonts w:cs="Calibri"/>
-          <w:bCs/>
-        </w:rPr>
-      </w:pPr>
-    </w:p>
-    <w:p>
-      <w:pPr>
-        <w:pStyle w:val="Textebrut"/>
-        <w:jc w:val="both"/>
-        <w:rPr>
           <w:rFonts w:cs="Calibri"/>
           <w:bCs/>
         </w:rPr>
@@ -1014,7 +883,23 @@
           <w:rFonts w:cs="Calibri"/>
           <w:bCs/>
         </w:rPr>
-        <w:t xml:space="preserve"> Remote Sensing of Environment. </w:t>
+        <w:t xml:space="preserve"> </w:t>
+      </w:r>
+      <w:r>
+        <w:rPr>
+          <w:rFonts w:cs="Calibri"/>
+          <w:bCs/>
+          <w:i/>
+          <w:iCs/>
+        </w:rPr>
+        <w:t>Remote Sensing of Environment.</w:t>
+      </w:r>
+      <w:r>
+        <w:rPr>
+          <w:rFonts w:cs="Calibri"/>
+          <w:bCs/>
+        </w:rPr>
+        <w:t xml:space="preserve"> </w:t>
       </w:r>
     </w:p>
     <w:p>
@@ -1106,44 +991,18 @@
         </w:rPr>
         <w:t xml:space="preserve">On behalf </w:t>
       </w:r>
-      <w:del w:id="17" w:author="simon oiry" w:date="2025-02-26T21:44:00Z" w16du:dateUtc="2025-02-26T20:44:00Z">
-        <w:r>
-          <w:rPr>
-            <w:lang w:val="en-AU"/>
-          </w:rPr>
-          <w:delText xml:space="preserve">of </w:delText>
-        </w:r>
-      </w:del>
-      <w:ins w:id="18" w:author="simon oiry" w:date="2025-02-26T21:44:00Z" w16du:dateUtc="2025-02-26T20:44:00Z">
-        <w:r>
-          <w:rPr>
-            <w:lang w:val="en-AU"/>
-          </w:rPr>
-          <w:t>of</w:t>
-        </w:r>
-        <w:r>
-          <w:rPr>
-            <w:lang w:val="en-AU"/>
-          </w:rPr>
-          <w:t xml:space="preserve"> the</w:t>
-        </w:r>
-      </w:ins>
-      <w:del w:id="19" w:author="simon oiry" w:date="2025-02-26T21:44:00Z" w16du:dateUtc="2025-02-26T20:44:00Z">
-        <w:r>
-          <w:rPr>
-            <w:lang w:val="en-AU"/>
-          </w:rPr>
-          <w:delText>all co-</w:delText>
-        </w:r>
-      </w:del>
-      <w:ins w:id="20" w:author="simon oiry" w:date="2025-02-26T21:44:00Z" w16du:dateUtc="2025-02-26T20:44:00Z">
-        <w:r>
-          <w:rPr>
-            <w:lang w:val="en-AU"/>
-          </w:rPr>
-          <w:t xml:space="preserve"> </w:t>
-        </w:r>
-      </w:ins>
+      <w:r>
+        <w:rPr>
+          <w:lang w:val="en-AU"/>
+        </w:rPr>
+        <w:t>of</w:t>
+      </w:r>
+      <w:r>
+        <w:rPr>
+          <w:lang w:val="en-AU"/>
+        </w:rPr>
+        <w:t xml:space="preserve"> the </w:t>
+      </w:r>
       <w:r>
         <w:rPr>
           <w:lang w:val="en-AU"/>
@@ -1779,14 +1638,6 @@
     <w:abstractNumId w:val="1"/>
   </w:num>
 </w:numbering>
-</file>
-
-<file path=word/people.xml><?xml version="1.0" encoding="utf-8"?>
-<w15:people xmlns:wpc="http://schemas.microsoft.com/office/word/2010/wordprocessingCanvas" xmlns:cx="http://schemas.microsoft.com/office/drawing/2014/chartex" xmlns:cx1="http://schemas.microsoft.com/office/drawing/2015/9/8/chartex" xmlns:cx2="http://schemas.microsoft.com/office/drawing/2015/10/21/chartex" xmlns:cx3="http://schemas.microsoft.com/office/drawing/2016/5/9/chartex" xmlns:cx4="http://schemas.microsoft.com/office/drawing/2016/5/10/chartex" xmlns:cx5="http://schemas.microsoft.com/office/drawing/2016/5/11/chartex" xmlns:cx6="http://schemas.microsoft.com/office/drawing/2016/5/12/chartex" xmlns:cx7="http://schemas.microsoft.com/office/drawing/2016/5/13/chartex" xmlns:cx8="http://schemas.microsoft.com/office/drawing/2016/5/14/chartex" xmlns:mc="http://schemas.openxmlformats.org/markup-compatibility/2006" xmlns:aink="http://schemas.microsoft.com/office/drawing/2016/ink" xmlns:am3d="http://schemas.microsoft.com/office/drawing/2017/model3d" xmlns:o="urn:schemas-microsoft-com:office:office" xmlns:oel="http://schemas.microsoft.com/office/2019/extlst" xmlns:r="http://schemas.openxmlformats.org/officeDocument/2006/relationships" xmlns:m="http://schemas.openxmlformats.org/officeDocument/2006/math" xmlns:v="urn:schemas-microsoft-com:vml" xmlns:wp14="http://schemas.microsoft.com/office/word/2010/wordprocessingDrawing" xmlns:wp="http://schemas.openxmlformats.org/drawingml/2006/wordprocessingDrawing" xmlns:w10="urn:schemas-microsoft-com:office:word" xmlns:w="http://schemas.openxmlformats.org/wordprocessingml/2006/main" xmlns:w14="http://schemas.microsoft.com/office/word/2010/wordml" xmlns:w15="http://schemas.microsoft.com/office/word/2012/wordml" xmlns:w16cex="http://schemas.microsoft.com/office/word/2018/wordml/cex" xmlns:w16cid="http://schemas.microsoft.com/office/word/2016/wordml/cid" xmlns:w16="http://schemas.microsoft.com/office/word/2018/wordml" xmlns:w16du="http://schemas.microsoft.com/office/word/2023/wordml/word16du" xmlns:w16sdtdh="http://schemas.microsoft.com/office/word/2020/wordml/sdtdatahash" xmlns:w16sdtfl="http://schemas.microsoft.com/office/word/2024/wordml/sdtformatlock" xmlns:w16se="http://schemas.microsoft.com/office/word/2015/wordml/symex" xmlns:wpg="http://schemas.microsoft.com/office/word/2010/wordprocessingGroup" xmlns:wpi="http://schemas.microsoft.com/office/word/2010/wordprocessingInk" xmlns:wne="http://schemas.microsoft.com/office/word/2006/wordml" xmlns:wps="http://schemas.microsoft.com/office/word/2010/wordprocessingShape" mc:Ignorable="w14 w15 w16se w16cid w16 w16cex w16sdtdh w16sdtfl w16du wp14">
-  <w15:person w15:author="simon oiry">
-    <w15:presenceInfo w15:providerId="Windows Live" w15:userId="27dd0463ded3d9d9"/>
-  </w15:person>
-</w15:people>
 </file>
 
 <file path=word/styles.xml><?xml version="1.0" encoding="utf-8"?>

</xml_diff>